<commit_message>
Sync profile copy and CV draft
Co-Authored-By: Claude Opus 5 <noreply@anthropic.com>
</commit_message>
<xml_diff>
--- a/2026-03-31 RQ - Main version - DRAFT.docx
+++ b/2026-03-31 RQ - Main version - DRAFT.docx
@@ -7202,7 +7202,7 @@
                 <w:szCs w:val="16"/>
                 <w:lang w:val="en-US"/>
               </w:rPr>
-              <w:t xml:space="preserve">HTML</w:t>
+              <w:t xml:space="preserve">GraphQL</w:t>
             </w:r>
           </w:p>
           <w:p>
@@ -7663,7 +7663,7 @@
                 <w:szCs w:val="16"/>
                 <w:lang w:val="en-US"/>
               </w:rPr>
-              <w:t xml:space="preserve">WordPress</w:t>
+              <w:t xml:space="preserve">React Native</w:t>
             </w:r>
           </w:p>
           <w:p>
@@ -10156,7 +10156,7 @@
                 <w:szCs w:val="16"/>
                 <w:lang w:val="en-US"/>
               </w:rPr>
-              <w:t xml:space="preserve">Mocha</w:t>
+              <w:t xml:space="preserve">GitLab CI</w:t>
             </w:r>
           </w:p>
           <w:p>
@@ -15179,7 +15179,7 @@
           <w:szCs w:val="14"/>
           <w:lang w:val="en-IN" w:eastAsia="nl-NL"/>
         </w:rPr>
-        <w:t xml:space="preserve">Rudy utilized powerful modern technologies such as AWS, Docker, Kubernetes, Node.js, TS, Angular, Flutter, SQL, and MongoDB. His work involved developing and maintaining the web app and its mobile adaptation, ensuring efficient logistics management.</w:t>
+        <w:t xml:space="preserve">Rudy utilized powerful modern technologies such as AWS, Docker, Kubernetes, Node.js, TS, Angular, Flutter, GitLab CI, SQL, and MongoDB. His work involved developing and maintaining the web app and its mobile adaptation, ensuring efficient logistics management.</w:t>
       </w:r>
     </w:p>
     <w:p>
@@ -16170,7 +16170,7 @@
           <w:szCs w:val="14"/>
           <w:lang w:val="en-IN" w:eastAsia="nl-NL"/>
         </w:rPr>
-        <w:t xml:space="preserve">Rudy utilized a wide array of technologies, including Shopify, WordPress, Wix, Ruby, Python, Node.js, TypeScript, Java, and Flutter. For cloud services, he leveraged AWS and GCP, and for scripting, he used Bash and Powershell. His teaching sessions were designed to empower students with practical skills and knowledge in web development. Despite specifying the end date of his freelance work as 2022, Rudy continues to keep his freelance business open and occasionally gives classes when he has free time.</w:t>
+        <w:t xml:space="preserve">Rudy utilized a wide array of technologies, including Shopify, WordPress, Wix, Ruby, Python, Node.js, TypeScript, Java, Flutter, React Native, and GraphQL. For cloud services, he leveraged AWS and GCP, and for scripting, he used Bash and Powershell. His teaching sessions were designed to empower students with practical skills and knowledge in web development. Despite specifying the end date of his freelance work as 2022, Rudy continues to keep his freelance business open and occasionally gives classes when he has free time.</w:t>
       </w:r>
     </w:p>
     <w:p>

</xml_diff>